<commit_message>
another batch of pairings
</commit_message>
<xml_diff>
--- a/Bowdies-Training-Reference-Pitch.docx
+++ b/Bowdies-Training-Reference-Pitch.docx
@@ -197,7 +197,7 @@
         <w:t xml:space="preserve">working recipe reference.</w:t>
       </w:r>
       <w:r>
-        <w:t xml:space="preserve"> Every cocktail on the program has its ingredient list and build instructions; every plated item has prep directions. A new bartender doesn’t guess — they look up the spec. A new prep cook stepping into the building has every standard in front of them, and doesn’t have to flip through pages of written recipes just to find one. The same document that teaches pairing also holds the build.</w:t>
+        <w:t xml:space="preserve"> Every cocktail on the program has its ingredient list and build instructions; every plated item has prep directions. A new bartender doesn’t guess — they look up the spec. A prep cook doesn’t have to flip through pages of written recipes just to find one. The same document that teaches pairing also holds the build.</w:t>
       </w:r>
     </w:p>
     <w:p>
@@ -222,7 +222,7 @@
         <w:spacing w:after="160" w:line="320"/>
       </w:pPr>
       <w:r>
-        <w:t xml:space="preserve">Right now, the knowledge that makes a Bowdie’s server great lives in the heads of the people who’ve been here the longest. When Amani explains why Sherried Speyside lands with the brownie, or why Bruichladdich plays differently than Laphroaig even though both are Islay — that’s institutional memory. It doesn’t scale. It doesn’t survive turnover. It doesn’t reach the new SA on week two who’s about to get a question they don’t know how to answer.</w:t>
+        <w:t xml:space="preserve">Right now, the knowledge that makes a Bowdie’s server great lives in the heads of the people who’ve been here the longest. When Manny explains why Sherried Speyside lands with the brownie, or Jess talks about how the Bowdie’s Old Fashioned plays differently than the Manhattan with an upcoming course — that’s institutional memory. It doesn’t scale with new locations. It doesn’t survive turnover. It doesn’t reach the new SA on week two who’s about to get a question they don’t know how to answer.</w:t>
       </w:r>
     </w:p>
     <w:p>
@@ -377,7 +377,7 @@
         <w:spacing w:after="160" w:line="320"/>
       </w:pPr>
       <w:r>
-        <w:t xml:space="preserve">Four position-focused modules — each one codifying what Bowdie’s expects from the people in that role, written so that someone who has never set foot in the restaurant would finish reading and know what we’re about:</w:t>
+        <w:t xml:space="preserve">Five position-focused modules — each one codifying what Bowdie’s expects from the people in that role, written so that someone who has never set foot in the restaurant would finish reading and know what we’re about:</w:t>
       </w:r>
     </w:p>
     <w:p>
@@ -458,6 +458,26 @@
       </w:r>
       <w:r>
         <w:t xml:space="preserve">— what separates a pour from a program.</w:t>
+      </w:r>
+    </w:p>
+    <w:p>
+      <w:pPr>
+        <w:pStyle w:val="ListParagraph"/>
+        <w:numPr>
+          <w:ilvl w:val="0"/>
+          <w:numId w:val="3"/>
+        </w:numPr>
+        <w:spacing w:after="100" w:line="300"/>
+      </w:pPr>
+      <w:r>
+        <w:rPr>
+          <w:b/>
+          <w:bCs/>
+        </w:rPr>
+        <w:t xml:space="preserve">Kitchen Best Practices </w:t>
+      </w:r>
+      <w:r>
+        <w:t xml:space="preserve">— recipes for success in a fast-paced environment.</w:t>
       </w:r>
     </w:p>
     <w:p>

</xml_diff>